<commit_message>
Week 3: Lab 3 Source code
</commit_message>
<xml_diff>
--- a/WEEK_2/LAB2.docx
+++ b/WEEK_2/LAB2.docx
@@ -1230,9 +1230,135 @@
           <w:tab w:val="left" w:pos="2182"/>
         </w:tabs>
       </w:pPr>
+      <w:r>
+        <w:t>Schematic:</w:t>
+      </w:r>
+    </w:p>
+    <w:p>
+      <w:pPr>
+        <w:tabs>
+          <w:tab w:val="left" w:pos="2182"/>
+        </w:tabs>
+      </w:pPr>
+      <w:r>
+        <w:drawing>
+          <wp:inline distT="0" distB="0" distL="0" distR="0" wp14:anchorId="4AF1A72C" wp14:editId="6756C1AC">
+            <wp:extent cx="5943600" cy="4099560"/>
+            <wp:effectExtent l="0" t="0" r="0" b="0"/>
+            <wp:docPr id="13" name="Picture 13"/>
+            <wp:cNvGraphicFramePr>
+              <a:graphicFrameLocks xmlns:a="http://schemas.openxmlformats.org/drawingml/2006/main" noChangeAspect="1"/>
+            </wp:cNvGraphicFramePr>
+            <a:graphic xmlns:a="http://schemas.openxmlformats.org/drawingml/2006/main">
+              <a:graphicData uri="http://schemas.openxmlformats.org/drawingml/2006/picture">
+                <pic:pic xmlns:pic="http://schemas.openxmlformats.org/drawingml/2006/picture">
+                  <pic:nvPicPr>
+                    <pic:cNvPr id="1" name=""/>
+                    <pic:cNvPicPr/>
+                  </pic:nvPicPr>
+                  <pic:blipFill>
+                    <a:blip r:embed="rId18"/>
+                    <a:stretch>
+                      <a:fillRect/>
+                    </a:stretch>
+                  </pic:blipFill>
+                  <pic:spPr>
+                    <a:xfrm>
+                      <a:off x="0" y="0"/>
+                      <a:ext cx="5943600" cy="4099560"/>
+                    </a:xfrm>
+                    <a:prstGeom prst="rect">
+                      <a:avLst/>
+                    </a:prstGeom>
+                  </pic:spPr>
+                </pic:pic>
+              </a:graphicData>
+            </a:graphic>
+          </wp:inline>
+        </w:drawing>
+      </w:r>
+    </w:p>
+    <w:p/>
+    <w:p/>
+    <w:p/>
+    <w:p/>
+    <w:p/>
+    <w:p/>
+    <w:p/>
+    <w:p/>
+    <w:p/>
+    <w:p/>
+    <w:p/>
+    <w:p>
+      <w:r>
+        <w:lastRenderedPageBreak/>
+        <w:t>Source code:</w:t>
+      </w:r>
+    </w:p>
+    <w:p>
+      <w:r>
+        <w:drawing>
+          <wp:inline distT="0" distB="0" distL="0" distR="0" wp14:anchorId="4CB44CDB" wp14:editId="423118AF">
+            <wp:extent cx="5943600" cy="4023360"/>
+            <wp:effectExtent l="0" t="0" r="0" b="0"/>
+            <wp:docPr id="14" name="Picture 14"/>
+            <wp:cNvGraphicFramePr>
+              <a:graphicFrameLocks xmlns:a="http://schemas.openxmlformats.org/drawingml/2006/main" noChangeAspect="1"/>
+            </wp:cNvGraphicFramePr>
+            <a:graphic xmlns:a="http://schemas.openxmlformats.org/drawingml/2006/main">
+              <a:graphicData uri="http://schemas.openxmlformats.org/drawingml/2006/picture">
+                <pic:pic xmlns:pic="http://schemas.openxmlformats.org/drawingml/2006/picture">
+                  <pic:nvPicPr>
+                    <pic:cNvPr id="1" name=""/>
+                    <pic:cNvPicPr/>
+                  </pic:nvPicPr>
+                  <pic:blipFill>
+                    <a:blip r:embed="rId19"/>
+                    <a:stretch>
+                      <a:fillRect/>
+                    </a:stretch>
+                  </pic:blipFill>
+                  <pic:spPr>
+                    <a:xfrm>
+                      <a:off x="0" y="0"/>
+                      <a:ext cx="5943600" cy="4023360"/>
+                    </a:xfrm>
+                    <a:prstGeom prst="rect">
+                      <a:avLst/>
+                    </a:prstGeom>
+                  </pic:spPr>
+                </pic:pic>
+              </a:graphicData>
+            </a:graphic>
+          </wp:inline>
+        </w:drawing>
+      </w:r>
+    </w:p>
+    <w:p/>
+    <w:p/>
+    <w:p/>
+    <w:p/>
+    <w:p/>
+    <w:p/>
+    <w:p/>
+    <w:p/>
+    <w:p/>
+    <w:p/>
+    <w:p/>
+    <w:p/>
+    <w:p>
+      <w:r>
+        <w:lastRenderedPageBreak/>
+        <w:t>EX10:</w:t>
+      </w:r>
+    </w:p>
+    <w:p>
+      <w:r>
+        <w:t>The animation is done by changing the display data. A fourth software timer (timer3) fires every 500 ms, and each time shiftLeftMatrix() moves every column of matrix_buffer one position to the left, wrapping the first column to the end. Meanwhile, updateLEDMatrix() keeps scanning the buffer as in Ex9, so the character appears to scroll continuously to the left. The timer interrupt still only runs timer_run().</w:t>
+      </w:r>
     </w:p>
     <w:sectPr>
-      <w:footerReference w:type="default" r:id="rId18"/>
+      <w:footerReference w:type="default" r:id="rId20"/>
       <w:pgSz w:w="12240" w:h="15840"/>
       <w:pgMar w:top="1440" w:right="1440" w:bottom="1440" w:left="1440" w:header="720" w:footer="720" w:gutter="0"/>
       <w:cols w:space="720"/>

</xml_diff>